<commit_message>
Feature 010 — Implementation Plan
</commit_message>
<xml_diff>
--- a/Samples/sample.template.docx
+++ b/Samples/sample.template.docx
@@ -21,11 +21,9 @@
         </w:rPr>
         <w:t xml:space="preserve">Project: </w:t>
       </w:r>
-      <w:fldSimple w:instr=" MERGEFIELD Project.Name ">
-        <w:r>
-          <w:t>«Project.Name»</w:t>
-        </w:r>
-      </w:fldSimple>
+      <w:r>
+        <w:t>{Project.Name}</w:t>
+      </w:r>
     </w:p>
     <w:p>
       <w:r>
@@ -34,11 +32,9 @@
         </w:rPr>
         <w:t xml:space="preserve">Contractor: </w:t>
       </w:r>
-      <w:fldSimple w:instr=" MERGEFIELD Contractor.Name  ">
-        <w:r>
-          <w:t>«Contractor.Name»</w:t>
-        </w:r>
-      </w:fldSimple>
+      <w:r>
+        <w:t>{Contractor.Name}</w:t>
+      </w:r>
     </w:p>
     <w:p>
       <w:r>
@@ -47,11 +43,9 @@
         </w:rPr>
         <w:t xml:space="preserve">Tax ID: </w:t>
       </w:r>
-      <w:fldSimple w:instr=" MERGEFIELD Contractor.TaxId  ">
-        <w:r>
-          <w:t>«Contractor.TaxId»</w:t>
-        </w:r>
-      </w:fldSimple>
+      <w:r>
+        <w:t>{Contractor.TaxId}</w:t>
+      </w:r>
     </w:p>
     <w:p>
       <w:r>
@@ -60,11 +54,9 @@
         </w:rPr>
         <w:t xml:space="preserve">Company registration: </w:t>
       </w:r>
-      <w:fldSimple w:instr=" MERGEFIELD Contractor.RegistrationNumber  ">
-        <w:r>
-          <w:t>«Contractor.RegistrationNumber»</w:t>
-        </w:r>
-      </w:fldSimple>
+      <w:r>
+        <w:t>{Contractor.RegistrationNumber}</w:t>
+      </w:r>
     </w:p>
     <w:p>
       <w:r>
@@ -73,11 +65,9 @@
         </w:rPr>
         <w:t xml:space="preserve">Address: </w:t>
       </w:r>
-      <w:fldSimple w:instr=" MERGEFIELD Contractor.Address  ">
-        <w:r>
-          <w:t>«Contractor.Address»</w:t>
-        </w:r>
-      </w:fldSimple>
+      <w:r>
+        <w:t>{Contractor.Address}</w:t>
+      </w:r>
     </w:p>
     <w:p>
       <w:r>
@@ -86,11 +76,9 @@
         </w:rPr>
         <w:t xml:space="preserve">Contact: </w:t>
       </w:r>
-      <w:fldSimple w:instr=" MERGEFIELD Contractor.Contact  ">
-        <w:r>
-          <w:t>«Contractor.Contact»</w:t>
-        </w:r>
-      </w:fldSimple>
+      <w:r>
+        <w:t>{Contractor.Contact}</w:t>
+      </w:r>
     </w:p>
     <w:p>
       <w:r>
@@ -99,11 +87,9 @@
         </w:rPr>
         <w:t xml:space="preserve">Email: </w:t>
       </w:r>
-      <w:fldSimple w:instr=" MERGEFIELD Contractor.Email  ">
-        <w:r>
-          <w:t>«Contractor.Email»</w:t>
-        </w:r>
-      </w:fldSimple>
+      <w:r>
+        <w:t>{Contractor.Email}</w:t>
+      </w:r>
     </w:p>
     <w:p>
       <w:r>
@@ -259,11 +245,9 @@
             <w:gridSpan w:val="8"/>
           </w:tcPr>
           <w:p>
-            <w:fldSimple w:instr=" MERGEFIELD TableStart:Materials  ">
-              <w:r>
-                <w:t>«TableStart:Materials»</w:t>
-              </w:r>
-            </w:fldSimple>
+            <w:r>
+              <w:t>{For:Materials}</w:t>
+            </w:r>
           </w:p>
         </w:tc>
       </w:tr>
@@ -273,11 +257,9 @@
             <w:tcW w:w="1300" w:type="dxa"/>
           </w:tcPr>
           <w:p>
-            <w:fldSimple w:instr=" MERGEFIELD Reference  ">
-              <w:r>
-                <w:t>«Reference»</w:t>
-              </w:r>
-            </w:fldSimple>
+            <w:r>
+              <w:t>{Reference}</w:t>
+            </w:r>
           </w:p>
         </w:tc>
         <w:tc>
@@ -285,11 +267,9 @@
             <w:tcW w:w="1400" w:type="dxa"/>
           </w:tcPr>
           <w:p>
-            <w:fldSimple w:instr=" MERGEFIELD DeliveryDate \@ &quot;dd MMM yyyy&quot; ">
-              <w:r>
-                <w:t>«DeliveryDate»</w:t>
-              </w:r>
-            </w:fldSimple>
+            <w:r>
+              <w:t>{DeliveryDate date:"dd MMM yyyy"}</w:t>
+            </w:r>
           </w:p>
         </w:tc>
         <w:tc>
@@ -297,11 +277,9 @@
             <w:tcW w:w="2300" w:type="dxa"/>
           </w:tcPr>
           <w:p>
-            <w:fldSimple w:instr=" MERGEFIELD Description  ">
-              <w:r>
-                <w:t>«Description»</w:t>
-              </w:r>
-            </w:fldSimple>
+            <w:r>
+              <w:t>{Description}</w:t>
+            </w:r>
           </w:p>
         </w:tc>
         <w:tc>
@@ -309,11 +287,9 @@
             <w:tcW w:w="700" w:type="dxa"/>
           </w:tcPr>
           <w:p>
-            <w:fldSimple w:instr=" MERGEFIELD Quantity \# &quot;0.##&quot; ">
-              <w:r>
-                <w:t>«Quantity»</w:t>
-              </w:r>
-            </w:fldSimple>
+            <w:r>
+              <w:t>{Quantity number:"0.##"}</w:t>
+            </w:r>
           </w:p>
         </w:tc>
         <w:tc>
@@ -321,11 +297,9 @@
             <w:tcW w:w="700" w:type="dxa"/>
           </w:tcPr>
           <w:p>
-            <w:fldSimple w:instr=" MERGEFIELD Unit ">
-              <w:r>
-                <w:t>«Unit»</w:t>
-              </w:r>
-            </w:fldSimple>
+            <w:r>
+              <w:t>{Unit}</w:t>
+            </w:r>
           </w:p>
         </w:tc>
         <w:tc>
@@ -333,11 +307,9 @@
             <w:tcW w:w="1100" w:type="dxa"/>
           </w:tcPr>
           <w:p>
-            <w:fldSimple w:instr=" MERGEFIELD UnitPrice \# &quot;#,##0.00&quot; ">
-              <w:r>
-                <w:t>«UnitPrice»</w:t>
-              </w:r>
-            </w:fldSimple>
+            <w:r>
+              <w:t>{UnitPrice number:"#,##0.00"}</w:t>
+            </w:r>
           </w:p>
         </w:tc>
         <w:tc>
@@ -345,11 +317,9 @@
             <w:tcW w:w="1400" w:type="dxa"/>
           </w:tcPr>
           <w:p>
-            <w:fldSimple w:instr=" MERGEFIELD LineTotal \# &quot;#,##0.00&quot; ">
-              <w:r>
-                <w:t>«LineTotal»</w:t>
-              </w:r>
-            </w:fldSimple>
+            <w:r>
+              <w:t>{LineTotal number:"#,##0.00"}</w:t>
+            </w:r>
           </w:p>
         </w:tc>
         <w:tc>
@@ -357,11 +327,9 @@
             <w:tcW w:w="1000" w:type="dxa"/>
           </w:tcPr>
           <w:p>
-            <w:fldSimple w:instr=" MERGEFIELD Currency  ">
-              <w:r>
-                <w:t>«Currency»</w:t>
-              </w:r>
-            </w:fldSimple>
+            <w:r>
+              <w:t>{Currency}</w:t>
+            </w:r>
           </w:p>
         </w:tc>
       </w:tr>
@@ -371,11 +339,9 @@
             <w:gridSpan w:val="8"/>
           </w:tcPr>
           <w:p>
-            <w:fldSimple w:instr=" MERGEFIELD TableEnd:Materials  ">
-              <w:r>
-                <w:t>«TableEnd:Materials»</w:t>
-              </w:r>
-            </w:fldSimple>
+            <w:r>
+              <w:t>{EndFor}</w:t>
+            </w:r>
           </w:p>
         </w:tc>
       </w:tr>
@@ -387,11 +353,9 @@
         </w:rPr>
         <w:t xml:space="preserve">Material items: </w:t>
       </w:r>
-      <w:fldSimple w:instr=" MERGEFIELD Totals.Count  ">
-        <w:r>
-          <w:t>«Totals.Count»</w:t>
-        </w:r>
-      </w:fldSimple>
+      <w:r>
+        <w:t>{Totals.Count}</w:t>
+      </w:r>
     </w:p>
     <w:p>
       <w:r>
@@ -400,19 +364,15 @@
         </w:rPr>
         <w:t xml:space="preserve">Total estimated cost: </w:t>
       </w:r>
-      <w:fldSimple w:instr=" MERGEFIELD Totals.Amount \# &quot;#,##0.00&quot; ">
-        <w:r>
-          <w:t>«Totals.Amount»</w:t>
-        </w:r>
-      </w:fldSimple>
+      <w:r>
+        <w:t>{Totals.Amount number:"#,##0.00"}</w:t>
+      </w:r>
       <w:r>
         <w:t xml:space="preserve"> </w:t>
       </w:r>
-      <w:fldSimple w:instr=" MERGEFIELD Totals.Currency  ">
-        <w:r>
-          <w:t>«Totals.Currency»</w:t>
-        </w:r>
-      </w:fldSimple>
+      <w:r>
+        <w:t>{Totals.Currency}</w:t>
+      </w:r>
     </w:p>
     <w:p>
       <w:r>
@@ -421,11 +381,9 @@
         </w:rPr>
         <w:t xml:space="preserve">Amount in words: </w:t>
       </w:r>
-      <w:fldSimple w:instr=" MERGEFIELD Totals.Amount \* SpellOut ">
-        <w:r>
-          <w:t>«Totals.Amount»</w:t>
-        </w:r>
-      </w:fldSimple>
+      <w:r>
+        <w:t>{Totals.Amount spellout}</w:t>
+      </w:r>
     </w:p>
     <w:sectPr>
       <w:pgSz w:w="11906" w:h="16838"/>

</xml_diff>